<commit_message>
Added the etw options and option builders
</commit_message>
<xml_diff>
--- a/ETW Extractor details.docx
+++ b/ETW Extractor details.docx
@@ -6,8 +6,16 @@
       <w:pPr>
         <w:pStyle w:val="Title"/>
       </w:pPr>
-      <w:r>
-        <w:t xml:space="preserve">ETW </w:t>
+      <w:proofErr w:type="spellStart"/>
+      <w:r>
+        <w:t>c</w:t>
+      </w:r>
+      <w:r>
+        <w:t>ETW</w:t>
+      </w:r>
+      <w:proofErr w:type="spellEnd"/>
+      <w:r>
+        <w:t xml:space="preserve"> </w:t>
       </w:r>
       <w:r>
         <w:t>Extractor</w:t>
@@ -107,9 +115,11 @@
       <w:r>
         <w:t xml:space="preserve">contract called </w:t>
       </w:r>
+      <w:proofErr w:type="spellStart"/>
       <w:r>
         <w:t>ApplyFilter</w:t>
       </w:r>
+      <w:proofErr w:type="spellEnd"/>
       <w:r>
         <w:t>()</w:t>
       </w:r>
@@ -219,6 +229,7 @@
         </w:rPr>
         <w:t xml:space="preserve">    </w:t>
       </w:r>
+      <w:proofErr w:type="spellStart"/>
       <w:r>
         <w:rPr>
           <w:rFonts w:ascii="Cascadia Mono" w:eastAsia="Times New Roman" w:hAnsi="Cascadia Mono" w:cs="Cascadia Mono"/>
@@ -241,6 +252,7 @@
         </w:rPr>
         <w:t>.EventName</w:t>
       </w:r>
+      <w:proofErr w:type="spellEnd"/>
     </w:p>
     <w:p>
       <w:pPr>
@@ -288,6 +300,7 @@
         </w:rPr>
         <w:t xml:space="preserve">    </w:t>
       </w:r>
+      <w:proofErr w:type="spellStart"/>
       <w:r>
         <w:rPr>
           <w:rFonts w:ascii="Cascadia Mono" w:eastAsia="Times New Roman" w:hAnsi="Cascadia Mono" w:cs="Cascadia Mono"/>
@@ -310,6 +323,7 @@
         </w:rPr>
         <w:t>.FormattedMessage</w:t>
       </w:r>
+      <w:proofErr w:type="spellEnd"/>
     </w:p>
     <w:p>
       <w:pPr>
@@ -357,6 +371,7 @@
         </w:rPr>
         <w:t xml:space="preserve">    </w:t>
       </w:r>
+      <w:proofErr w:type="spellStart"/>
       <w:r>
         <w:rPr>
           <w:rFonts w:ascii="Cascadia Mono" w:eastAsia="Times New Roman" w:hAnsi="Cascadia Mono" w:cs="Cascadia Mono"/>
@@ -379,6 +394,7 @@
         </w:rPr>
         <w:t>.KernelTime</w:t>
       </w:r>
+      <w:proofErr w:type="spellEnd"/>
     </w:p>
     <w:p>
       <w:pPr>
@@ -426,6 +442,7 @@
         </w:rPr>
         <w:t xml:space="preserve">    </w:t>
       </w:r>
+      <w:proofErr w:type="spellStart"/>
       <w:r>
         <w:rPr>
           <w:rFonts w:ascii="Cascadia Mono" w:eastAsia="Times New Roman" w:hAnsi="Cascadia Mono" w:cs="Cascadia Mono"/>
@@ -448,6 +465,7 @@
         </w:rPr>
         <w:t>.Level</w:t>
       </w:r>
+      <w:proofErr w:type="spellEnd"/>
     </w:p>
     <w:p>
       <w:pPr>
@@ -495,6 +513,7 @@
         </w:rPr>
         <w:t xml:space="preserve">    </w:t>
       </w:r>
+      <w:proofErr w:type="spellStart"/>
       <w:r>
         <w:rPr>
           <w:rFonts w:ascii="Cascadia Mono" w:eastAsia="Times New Roman" w:hAnsi="Cascadia Mono" w:cs="Cascadia Mono"/>
@@ -517,6 +536,7 @@
         </w:rPr>
         <w:t>.ProcessID</w:t>
       </w:r>
+      <w:proofErr w:type="spellEnd"/>
     </w:p>
     <w:p>
       <w:pPr>
@@ -564,6 +584,7 @@
         </w:rPr>
         <w:t xml:space="preserve">    </w:t>
       </w:r>
+      <w:proofErr w:type="spellStart"/>
       <w:r>
         <w:rPr>
           <w:rFonts w:ascii="Cascadia Mono" w:eastAsia="Times New Roman" w:hAnsi="Cascadia Mono" w:cs="Cascadia Mono"/>
@@ -586,6 +607,7 @@
         </w:rPr>
         <w:t>.ProcessName</w:t>
       </w:r>
+      <w:proofErr w:type="spellEnd"/>
     </w:p>
     <w:p>
       <w:pPr>
@@ -633,6 +655,7 @@
         </w:rPr>
         <w:t xml:space="preserve">    </w:t>
       </w:r>
+      <w:proofErr w:type="spellStart"/>
       <w:r>
         <w:rPr>
           <w:rFonts w:ascii="Cascadia Mono" w:eastAsia="Times New Roman" w:hAnsi="Cascadia Mono" w:cs="Cascadia Mono"/>
@@ -655,6 +678,7 @@
         </w:rPr>
         <w:t>.ProviderGuid</w:t>
       </w:r>
+      <w:proofErr w:type="spellEnd"/>
     </w:p>
     <w:p>
       <w:pPr>
@@ -694,6 +718,7 @@
         </w:rPr>
         <w:t xml:space="preserve">    </w:t>
       </w:r>
+      <w:proofErr w:type="spellStart"/>
       <w:r>
         <w:rPr>
           <w:rFonts w:ascii="Cascadia Mono" w:eastAsia="Times New Roman" w:hAnsi="Cascadia Mono" w:cs="Cascadia Mono"/>
@@ -716,6 +741,7 @@
         </w:rPr>
         <w:t>.ProviderName</w:t>
       </w:r>
+      <w:proofErr w:type="spellEnd"/>
     </w:p>
     <w:p>
       <w:pPr>
@@ -805,7 +831,15 @@
         <w:t xml:space="preserve">reader will </w:t>
       </w:r>
       <w:r>
-        <w:t>inherit from the IAsyncEnumerable&lt;T&gt;</w:t>
+        <w:t xml:space="preserve">inherit from the </w:t>
+      </w:r>
+      <w:proofErr w:type="spellStart"/>
+      <w:r>
+        <w:t>IAsyncEnumerable</w:t>
+      </w:r>
+      <w:proofErr w:type="spellEnd"/>
+      <w:r>
+        <w:t>&lt;T&gt;</w:t>
       </w:r>
       <w:r>
         <w:t xml:space="preserve"> interface.</w:t>
@@ -889,6 +923,7 @@
         </w:rPr>
         <w:t xml:space="preserve">    </w:t>
       </w:r>
+      <w:proofErr w:type="spellStart"/>
       <w:r>
         <w:rPr>
           <w:rFonts w:ascii="Cascadia Mono" w:eastAsia="Times New Roman" w:hAnsi="Cascadia Mono" w:cs="Cascadia Mono"/>
@@ -911,6 +946,7 @@
         </w:rPr>
         <w:t>.EventName</w:t>
       </w:r>
+      <w:proofErr w:type="spellEnd"/>
     </w:p>
     <w:p>
       <w:pPr>
@@ -958,6 +994,7 @@
         </w:rPr>
         <w:t xml:space="preserve">    </w:t>
       </w:r>
+      <w:proofErr w:type="spellStart"/>
       <w:r>
         <w:rPr>
           <w:rFonts w:ascii="Cascadia Mono" w:eastAsia="Times New Roman" w:hAnsi="Cascadia Mono" w:cs="Cascadia Mono"/>
@@ -980,6 +1017,7 @@
         </w:rPr>
         <w:t>.FormattedMessage</w:t>
       </w:r>
+      <w:proofErr w:type="spellEnd"/>
     </w:p>
     <w:p>
       <w:pPr>
@@ -1027,6 +1065,7 @@
         </w:rPr>
         <w:t xml:space="preserve">    </w:t>
       </w:r>
+      <w:proofErr w:type="spellStart"/>
       <w:r>
         <w:rPr>
           <w:rFonts w:ascii="Cascadia Mono" w:eastAsia="Times New Roman" w:hAnsi="Cascadia Mono" w:cs="Cascadia Mono"/>
@@ -1049,6 +1088,7 @@
         </w:rPr>
         <w:t>.KernelTime</w:t>
       </w:r>
+      <w:proofErr w:type="spellEnd"/>
     </w:p>
     <w:p>
       <w:pPr>
@@ -1096,6 +1136,7 @@
         </w:rPr>
         <w:t xml:space="preserve">    </w:t>
       </w:r>
+      <w:proofErr w:type="spellStart"/>
       <w:r>
         <w:rPr>
           <w:rFonts w:ascii="Cascadia Mono" w:eastAsia="Times New Roman" w:hAnsi="Cascadia Mono" w:cs="Cascadia Mono"/>
@@ -1118,6 +1159,7 @@
         </w:rPr>
         <w:t>.Level</w:t>
       </w:r>
+      <w:proofErr w:type="spellEnd"/>
     </w:p>
     <w:p>
       <w:pPr>
@@ -1165,6 +1207,7 @@
         </w:rPr>
         <w:t xml:space="preserve">    </w:t>
       </w:r>
+      <w:proofErr w:type="spellStart"/>
       <w:r>
         <w:rPr>
           <w:rFonts w:ascii="Cascadia Mono" w:eastAsia="Times New Roman" w:hAnsi="Cascadia Mono" w:cs="Cascadia Mono"/>
@@ -1187,6 +1230,7 @@
         </w:rPr>
         <w:t>.ProcessID</w:t>
       </w:r>
+      <w:proofErr w:type="spellEnd"/>
     </w:p>
     <w:p>
       <w:pPr>
@@ -1234,6 +1278,7 @@
         </w:rPr>
         <w:t xml:space="preserve">    </w:t>
       </w:r>
+      <w:proofErr w:type="spellStart"/>
       <w:r>
         <w:rPr>
           <w:rFonts w:ascii="Cascadia Mono" w:eastAsia="Times New Roman" w:hAnsi="Cascadia Mono" w:cs="Cascadia Mono"/>
@@ -1256,6 +1301,7 @@
         </w:rPr>
         <w:t>.ProcessName</w:t>
       </w:r>
+      <w:proofErr w:type="spellEnd"/>
     </w:p>
     <w:p>
       <w:pPr>
@@ -1303,6 +1349,7 @@
         </w:rPr>
         <w:t xml:space="preserve">    </w:t>
       </w:r>
+      <w:proofErr w:type="spellStart"/>
       <w:r>
         <w:rPr>
           <w:rFonts w:ascii="Cascadia Mono" w:eastAsia="Times New Roman" w:hAnsi="Cascadia Mono" w:cs="Cascadia Mono"/>
@@ -1325,6 +1372,7 @@
         </w:rPr>
         <w:t>.ProviderGuid</w:t>
       </w:r>
+      <w:proofErr w:type="spellEnd"/>
     </w:p>
     <w:p>
       <w:pPr>
@@ -1364,6 +1412,7 @@
         </w:rPr>
         <w:t xml:space="preserve">    </w:t>
       </w:r>
+      <w:proofErr w:type="spellStart"/>
       <w:r>
         <w:rPr>
           <w:rFonts w:ascii="Cascadia Mono" w:eastAsia="Times New Roman" w:hAnsi="Cascadia Mono" w:cs="Cascadia Mono"/>
@@ -1386,6 +1435,7 @@
         </w:rPr>
         <w:t>.ProviderName</w:t>
       </w:r>
+      <w:proofErr w:type="spellEnd"/>
     </w:p>
     <w:p>
       <w:pPr>
@@ -1425,6 +1475,7 @@
         </w:rPr>
         <w:t xml:space="preserve">    </w:t>
       </w:r>
+      <w:proofErr w:type="spellStart"/>
       <w:r>
         <w:rPr>
           <w:rFonts w:ascii="Cascadia Mono" w:eastAsia="Times New Roman" w:hAnsi="Cascadia Mono" w:cs="Cascadia Mono"/>
@@ -1456,7 +1507,19 @@
           <w:szCs w:val="18"/>
           <w14:ligatures w14:val="none"/>
         </w:rPr>
-        <w:t xml:space="preserve">t time </w:t>
+        <w:t>t</w:t>
+      </w:r>
+      <w:proofErr w:type="spellEnd"/>
+      <w:r>
+        <w:rPr>
+          <w:rFonts w:ascii="Cascadia Mono" w:eastAsia="Times New Roman" w:hAnsi="Cascadia Mono" w:cs="Cascadia Mono"/>
+          <w:color w:val="000000"/>
+          <w:kern w:val="0"/>
+          <w:sz w:val="18"/>
+          <w:szCs w:val="18"/>
+          <w14:ligatures w14:val="none"/>
+        </w:rPr>
+        <w:t xml:space="preserve"> time </w:t>
       </w:r>
     </w:p>
     <w:p>
@@ -1713,7 +1776,27 @@
           <w:sz w:val="17"/>
           <w:szCs w:val="17"/>
         </w:rPr>
-        <w:t xml:space="preserve">CREATE TABLE etw_events ( </w:t>
+        <w:t xml:space="preserve">CREATE TABLE </w:t>
+      </w:r>
+      <w:proofErr w:type="spellStart"/>
+      <w:r>
+        <w:rPr>
+          <w:rFonts w:ascii="Consolas" w:hAnsi="Consolas" w:cs="Courier New"/>
+          <w:color w:val="000000"/>
+          <w:sz w:val="17"/>
+          <w:szCs w:val="17"/>
+        </w:rPr>
+        <w:t>etw_events</w:t>
+      </w:r>
+      <w:proofErr w:type="spellEnd"/>
+      <w:r>
+        <w:rPr>
+          <w:rFonts w:ascii="Consolas" w:hAnsi="Consolas" w:cs="Courier New"/>
+          <w:color w:val="000000"/>
+          <w:sz w:val="17"/>
+          <w:szCs w:val="17"/>
+        </w:rPr>
+        <w:t xml:space="preserve"> ( </w:t>
       </w:r>
     </w:p>
     <w:p>
@@ -1871,14 +1954,25 @@
         </w:rPr>
         <w:tab/>
       </w:r>
-      <w:r>
-        <w:rPr>
-          <w:rFonts w:ascii="Consolas" w:hAnsi="Consolas" w:cs="Courier New"/>
-          <w:color w:val="000000"/>
-          <w:sz w:val="17"/>
-          <w:szCs w:val="17"/>
-        </w:rPr>
-        <w:t>event_name TEXT NOT NULL,</w:t>
+      <w:proofErr w:type="spellStart"/>
+      <w:r>
+        <w:rPr>
+          <w:rFonts w:ascii="Consolas" w:hAnsi="Consolas" w:cs="Courier New"/>
+          <w:color w:val="000000"/>
+          <w:sz w:val="17"/>
+          <w:szCs w:val="17"/>
+        </w:rPr>
+        <w:t>event_name</w:t>
+      </w:r>
+      <w:proofErr w:type="spellEnd"/>
+      <w:r>
+        <w:rPr>
+          <w:rFonts w:ascii="Consolas" w:hAnsi="Consolas" w:cs="Courier New"/>
+          <w:color w:val="000000"/>
+          <w:sz w:val="17"/>
+          <w:szCs w:val="17"/>
+        </w:rPr>
+        <w:t xml:space="preserve"> TEXT NOT NULL,</w:t>
       </w:r>
     </w:p>
     <w:p>
@@ -1981,14 +2075,25 @@
         </w:rPr>
         <w:tab/>
       </w:r>
-      <w:r>
-        <w:rPr>
-          <w:rFonts w:ascii="Consolas" w:hAnsi="Consolas" w:cs="Courier New"/>
-          <w:color w:val="000000"/>
-          <w:sz w:val="17"/>
-          <w:szCs w:val="17"/>
-        </w:rPr>
-        <w:t>process_id INTEGER NOT NULL,</w:t>
+      <w:proofErr w:type="spellStart"/>
+      <w:r>
+        <w:rPr>
+          <w:rFonts w:ascii="Consolas" w:hAnsi="Consolas" w:cs="Courier New"/>
+          <w:color w:val="000000"/>
+          <w:sz w:val="17"/>
+          <w:szCs w:val="17"/>
+        </w:rPr>
+        <w:t>process_id</w:t>
+      </w:r>
+      <w:proofErr w:type="spellEnd"/>
+      <w:r>
+        <w:rPr>
+          <w:rFonts w:ascii="Consolas" w:hAnsi="Consolas" w:cs="Courier New"/>
+          <w:color w:val="000000"/>
+          <w:sz w:val="17"/>
+          <w:szCs w:val="17"/>
+        </w:rPr>
+        <w:t xml:space="preserve"> INTEGER NOT NULL,</w:t>
       </w:r>
     </w:p>
     <w:p>
@@ -2036,14 +2141,25 @@
         </w:rPr>
         <w:tab/>
       </w:r>
-      <w:r>
-        <w:rPr>
-          <w:rFonts w:ascii="Consolas" w:hAnsi="Consolas" w:cs="Courier New"/>
-          <w:color w:val="000000"/>
-          <w:sz w:val="17"/>
-          <w:szCs w:val="17"/>
-        </w:rPr>
-        <w:t>process_name TEXT NOT NULL,</w:t>
+      <w:proofErr w:type="spellStart"/>
+      <w:r>
+        <w:rPr>
+          <w:rFonts w:ascii="Consolas" w:hAnsi="Consolas" w:cs="Courier New"/>
+          <w:color w:val="000000"/>
+          <w:sz w:val="17"/>
+          <w:szCs w:val="17"/>
+        </w:rPr>
+        <w:t>process_name</w:t>
+      </w:r>
+      <w:proofErr w:type="spellEnd"/>
+      <w:r>
+        <w:rPr>
+          <w:rFonts w:ascii="Consolas" w:hAnsi="Consolas" w:cs="Courier New"/>
+          <w:color w:val="000000"/>
+          <w:sz w:val="17"/>
+          <w:szCs w:val="17"/>
+        </w:rPr>
+        <w:t xml:space="preserve"> TEXT NOT NULL,</w:t>
       </w:r>
     </w:p>
     <w:p>
@@ -2091,14 +2207,25 @@
         </w:rPr>
         <w:tab/>
       </w:r>
-      <w:r>
-        <w:rPr>
-          <w:rFonts w:ascii="Consolas" w:hAnsi="Consolas" w:cs="Courier New"/>
-          <w:color w:val="000000"/>
-          <w:sz w:val="17"/>
-          <w:szCs w:val="17"/>
-        </w:rPr>
-        <w:t>provider_guid TEXT NOT NULL,</w:t>
+      <w:proofErr w:type="spellStart"/>
+      <w:r>
+        <w:rPr>
+          <w:rFonts w:ascii="Consolas" w:hAnsi="Consolas" w:cs="Courier New"/>
+          <w:color w:val="000000"/>
+          <w:sz w:val="17"/>
+          <w:szCs w:val="17"/>
+        </w:rPr>
+        <w:t>provider_guid</w:t>
+      </w:r>
+      <w:proofErr w:type="spellEnd"/>
+      <w:r>
+        <w:rPr>
+          <w:rFonts w:ascii="Consolas" w:hAnsi="Consolas" w:cs="Courier New"/>
+          <w:color w:val="000000"/>
+          <w:sz w:val="17"/>
+          <w:szCs w:val="17"/>
+        </w:rPr>
+        <w:t xml:space="preserve"> TEXT NOT NULL,</w:t>
       </w:r>
     </w:p>
     <w:p>
@@ -2201,14 +2328,25 @@
         </w:rPr>
         <w:tab/>
       </w:r>
-      <w:r>
-        <w:rPr>
-          <w:rFonts w:ascii="Consolas" w:hAnsi="Consolas" w:cs="Courier New"/>
-          <w:color w:val="000000"/>
-          <w:sz w:val="17"/>
-          <w:szCs w:val="17"/>
-        </w:rPr>
-        <w:t>kernel_time INTEGER NOT NULL,</w:t>
+      <w:proofErr w:type="spellStart"/>
+      <w:r>
+        <w:rPr>
+          <w:rFonts w:ascii="Consolas" w:hAnsi="Consolas" w:cs="Courier New"/>
+          <w:color w:val="000000"/>
+          <w:sz w:val="17"/>
+          <w:szCs w:val="17"/>
+        </w:rPr>
+        <w:t>kernel_time</w:t>
+      </w:r>
+      <w:proofErr w:type="spellEnd"/>
+      <w:r>
+        <w:rPr>
+          <w:rFonts w:ascii="Consolas" w:hAnsi="Consolas" w:cs="Courier New"/>
+          <w:color w:val="000000"/>
+          <w:sz w:val="17"/>
+          <w:szCs w:val="17"/>
+        </w:rPr>
+        <w:t xml:space="preserve"> INTEGER NOT NULL,</w:t>
       </w:r>
     </w:p>
     <w:p>
@@ -2392,7 +2530,27 @@
           <w:sz w:val="17"/>
           <w:szCs w:val="17"/>
         </w:rPr>
-        <w:t xml:space="preserve">CREATE INDEX idx_etw_events_timestamp </w:t>
+        <w:t xml:space="preserve">CREATE INDEX </w:t>
+      </w:r>
+      <w:proofErr w:type="spellStart"/>
+      <w:r>
+        <w:rPr>
+          <w:rFonts w:ascii="Consolas" w:hAnsi="Consolas" w:cs="Courier New"/>
+          <w:color w:val="000000"/>
+          <w:sz w:val="17"/>
+          <w:szCs w:val="17"/>
+        </w:rPr>
+        <w:t>idx_etw_events_timestamp</w:t>
+      </w:r>
+      <w:proofErr w:type="spellEnd"/>
+      <w:r>
+        <w:rPr>
+          <w:rFonts w:ascii="Consolas" w:hAnsi="Consolas" w:cs="Courier New"/>
+          <w:color w:val="000000"/>
+          <w:sz w:val="17"/>
+          <w:szCs w:val="17"/>
+        </w:rPr>
+        <w:t xml:space="preserve"> </w:t>
       </w:r>
     </w:p>
     <w:p>
@@ -2447,7 +2605,27 @@
           <w:sz w:val="17"/>
           <w:szCs w:val="17"/>
         </w:rPr>
-        <w:t xml:space="preserve">ON etw_events(timestamp); </w:t>
+        <w:t xml:space="preserve">ON </w:t>
+      </w:r>
+      <w:proofErr w:type="spellStart"/>
+      <w:r>
+        <w:rPr>
+          <w:rFonts w:ascii="Consolas" w:hAnsi="Consolas" w:cs="Courier New"/>
+          <w:color w:val="000000"/>
+          <w:sz w:val="17"/>
+          <w:szCs w:val="17"/>
+        </w:rPr>
+        <w:t>etw_events</w:t>
+      </w:r>
+      <w:proofErr w:type="spellEnd"/>
+      <w:r>
+        <w:rPr>
+          <w:rFonts w:ascii="Consolas" w:hAnsi="Consolas" w:cs="Courier New"/>
+          <w:color w:val="000000"/>
+          <w:sz w:val="17"/>
+          <w:szCs w:val="17"/>
+        </w:rPr>
+        <w:t xml:space="preserve">(timestamp); </w:t>
       </w:r>
     </w:p>
     <w:p>
@@ -2530,7 +2708,27 @@
           <w:sz w:val="17"/>
           <w:szCs w:val="17"/>
         </w:rPr>
-        <w:t>CREATE TABLE etw_kafka_offset (</w:t>
+        <w:t xml:space="preserve">CREATE TABLE </w:t>
+      </w:r>
+      <w:proofErr w:type="spellStart"/>
+      <w:r>
+        <w:rPr>
+          <w:rFonts w:ascii="Consolas" w:hAnsi="Consolas" w:cs="Courier New"/>
+          <w:color w:val="000000"/>
+          <w:sz w:val="17"/>
+          <w:szCs w:val="17"/>
+        </w:rPr>
+        <w:t>etw_kafka_offset</w:t>
+      </w:r>
+      <w:proofErr w:type="spellEnd"/>
+      <w:r>
+        <w:rPr>
+          <w:rFonts w:ascii="Consolas" w:hAnsi="Consolas" w:cs="Courier New"/>
+          <w:color w:val="000000"/>
+          <w:sz w:val="17"/>
+          <w:szCs w:val="17"/>
+        </w:rPr>
+        <w:t xml:space="preserve"> (</w:t>
       </w:r>
     </w:p>
     <w:p>
@@ -2633,14 +2831,25 @@
         </w:rPr>
         <w:tab/>
       </w:r>
-      <w:r>
-        <w:rPr>
-          <w:rFonts w:ascii="Consolas" w:hAnsi="Consolas" w:cs="Courier New"/>
-          <w:color w:val="000000"/>
-          <w:sz w:val="17"/>
-          <w:szCs w:val="17"/>
-        </w:rPr>
-        <w:t>updated_at DATETIME NOT NULL</w:t>
+      <w:proofErr w:type="spellStart"/>
+      <w:r>
+        <w:rPr>
+          <w:rFonts w:ascii="Consolas" w:hAnsi="Consolas" w:cs="Courier New"/>
+          <w:color w:val="000000"/>
+          <w:sz w:val="17"/>
+          <w:szCs w:val="17"/>
+        </w:rPr>
+        <w:t>updated_at</w:t>
+      </w:r>
+      <w:proofErr w:type="spellEnd"/>
+      <w:r>
+        <w:rPr>
+          <w:rFonts w:ascii="Consolas" w:hAnsi="Consolas" w:cs="Courier New"/>
+          <w:color w:val="000000"/>
+          <w:sz w:val="17"/>
+          <w:szCs w:val="17"/>
+        </w:rPr>
+        <w:t xml:space="preserve"> DATETIME NOT NULL</w:t>
       </w:r>
     </w:p>
     <w:p>
@@ -2714,7 +2923,23 @@
         <w:t xml:space="preserve">to listen to the related kernel events. </w:t>
       </w:r>
       <w:r>
-        <w:t xml:space="preserve">Profile, SystemCall, ContextSwitch, and Interrupt emit </w:t>
+        <w:t xml:space="preserve">Profile, </w:t>
+      </w:r>
+      <w:proofErr w:type="spellStart"/>
+      <w:r>
+        <w:t>SystemCall</w:t>
+      </w:r>
+      <w:proofErr w:type="spellEnd"/>
+      <w:r>
+        <w:t xml:space="preserve">, </w:t>
+      </w:r>
+      <w:proofErr w:type="spellStart"/>
+      <w:r>
+        <w:t>ContextSwitch</w:t>
+      </w:r>
+      <w:proofErr w:type="spellEnd"/>
+      <w:r>
+        <w:t xml:space="preserve">, and Interrupt emit </w:t>
       </w:r>
       <w:r>
         <w:t>at an extremely high</w:t>
@@ -2727,9 +2952,11 @@
       <w:r>
         <w:t>These are in the “</w:t>
       </w:r>
+      <w:proofErr w:type="spellStart"/>
       <w:r>
         <w:t>Microsoft.Diagnostics.Tracing.Parsers</w:t>
       </w:r>
+      <w:proofErr w:type="spellEnd"/>
       <w:r>
         <w:t>” package</w:t>
       </w:r>
@@ -2739,22 +2966,32 @@
       <w:r>
         <w:t>“</w:t>
       </w:r>
+      <w:proofErr w:type="spellStart"/>
       <w:r>
         <w:t>KernelTraceEventParser.Keywords</w:t>
       </w:r>
+      <w:proofErr w:type="spellEnd"/>
       <w:r>
         <w:t>”. For example, “</w:t>
       </w:r>
+      <w:proofErr w:type="spellStart"/>
       <w:r>
         <w:t>KernelTraceEventParser.Keywords.</w:t>
       </w:r>
       <w:r>
-        <w:t>NetworkTCPIP”.</w:t>
+        <w:t>NetworkTCPIP</w:t>
+      </w:r>
+      <w:proofErr w:type="spellEnd"/>
+      <w:r>
+        <w:t>”.</w:t>
       </w:r>
     </w:p>
     <w:p>
       <w:r>
-        <w:t>The list full list is below:</w:t>
+        <w:t>The</w:t>
+      </w:r>
+      <w:r>
+        <w:t xml:space="preserve"> full list is below:</w:t>
       </w:r>
     </w:p>
     <w:p>
@@ -2792,6 +3029,7 @@
         </w:rPr>
         <w:br/>
       </w:r>
+      <w:proofErr w:type="spellStart"/>
       <w:r>
         <w:rPr>
           <w:rFonts w:ascii="Consolas" w:hAnsi="Consolas" w:cs="Courier New"/>
@@ -2800,6 +3038,7 @@
         </w:rPr>
         <w:t>DiskFileIO</w:t>
       </w:r>
+      <w:proofErr w:type="spellEnd"/>
       <w:r>
         <w:rPr>
           <w:rFonts w:ascii="Consolas" w:hAnsi="Consolas" w:cs="Courier New"/>
@@ -2808,6 +3047,7 @@
         </w:rPr>
         <w:br/>
       </w:r>
+      <w:proofErr w:type="spellStart"/>
       <w:r>
         <w:rPr>
           <w:rFonts w:ascii="Consolas" w:hAnsi="Consolas" w:cs="Courier New"/>
@@ -2816,6 +3056,7 @@
         </w:rPr>
         <w:t>DiskIO</w:t>
       </w:r>
+      <w:proofErr w:type="spellEnd"/>
       <w:r>
         <w:rPr>
           <w:rFonts w:ascii="Consolas" w:hAnsi="Consolas" w:cs="Courier New"/>
@@ -2824,6 +3065,7 @@
         </w:rPr>
         <w:br/>
       </w:r>
+      <w:proofErr w:type="spellStart"/>
       <w:r>
         <w:rPr>
           <w:rFonts w:ascii="Consolas" w:hAnsi="Consolas" w:cs="Courier New"/>
@@ -2832,6 +3074,7 @@
         </w:rPr>
         <w:t>ImageLoad</w:t>
       </w:r>
+      <w:proofErr w:type="spellEnd"/>
       <w:r>
         <w:rPr>
           <w:rFonts w:ascii="Consolas" w:hAnsi="Consolas" w:cs="Courier New"/>
@@ -2840,6 +3083,7 @@
         </w:rPr>
         <w:br/>
       </w:r>
+      <w:proofErr w:type="spellStart"/>
       <w:r>
         <w:rPr>
           <w:rFonts w:ascii="Consolas" w:hAnsi="Consolas" w:cs="Courier New"/>
@@ -2848,6 +3092,7 @@
         </w:rPr>
         <w:t>MemoryHardFaults</w:t>
       </w:r>
+      <w:proofErr w:type="spellEnd"/>
       <w:r>
         <w:rPr>
           <w:rFonts w:ascii="Consolas" w:hAnsi="Consolas" w:cs="Courier New"/>
@@ -2856,6 +3101,7 @@
         </w:rPr>
         <w:br/>
       </w:r>
+      <w:proofErr w:type="spellStart"/>
       <w:r>
         <w:rPr>
           <w:rFonts w:ascii="Consolas" w:hAnsi="Consolas" w:cs="Courier New"/>
@@ -2864,6 +3110,7 @@
         </w:rPr>
         <w:t>NetworkTCPIP</w:t>
       </w:r>
+      <w:proofErr w:type="spellEnd"/>
       <w:r>
         <w:rPr>
           <w:rFonts w:ascii="Consolas" w:hAnsi="Consolas" w:cs="Courier New"/>
@@ -2888,6 +3135,7 @@
         </w:rPr>
         <w:br/>
       </w:r>
+      <w:proofErr w:type="spellStart"/>
       <w:r>
         <w:rPr>
           <w:rFonts w:ascii="Consolas" w:hAnsi="Consolas" w:cs="Courier New"/>
@@ -2896,6 +3144,7 @@
         </w:rPr>
         <w:t>ProcessCounters</w:t>
       </w:r>
+      <w:proofErr w:type="spellEnd"/>
       <w:r>
         <w:rPr>
           <w:rFonts w:ascii="Consolas" w:hAnsi="Consolas" w:cs="Courier New"/>
@@ -2936,6 +3185,7 @@
         </w:rPr>
         <w:br/>
       </w:r>
+      <w:proofErr w:type="spellStart"/>
       <w:r>
         <w:rPr>
           <w:rFonts w:ascii="Consolas" w:hAnsi="Consolas" w:cs="Courier New"/>
@@ -2944,6 +3194,7 @@
         </w:rPr>
         <w:t>ContextSwitch</w:t>
       </w:r>
+      <w:proofErr w:type="spellEnd"/>
       <w:r>
         <w:rPr>
           <w:rFonts w:ascii="Consolas" w:hAnsi="Consolas" w:cs="Courier New"/>
@@ -2952,6 +3203,7 @@
         </w:rPr>
         <w:br/>
       </w:r>
+      <w:proofErr w:type="spellStart"/>
       <w:r>
         <w:rPr>
           <w:rFonts w:ascii="Consolas" w:hAnsi="Consolas" w:cs="Courier New"/>
@@ -2960,6 +3212,7 @@
         </w:rPr>
         <w:t>DiskIOInit</w:t>
       </w:r>
+      <w:proofErr w:type="spellEnd"/>
       <w:r>
         <w:rPr>
           <w:rFonts w:ascii="Consolas" w:hAnsi="Consolas" w:cs="Courier New"/>
@@ -2984,6 +3237,7 @@
         </w:rPr>
         <w:br/>
       </w:r>
+      <w:proofErr w:type="spellStart"/>
       <w:r>
         <w:rPr>
           <w:rFonts w:ascii="Consolas" w:hAnsi="Consolas" w:cs="Courier New"/>
@@ -2992,6 +3246,7 @@
         </w:rPr>
         <w:t>FileIO</w:t>
       </w:r>
+      <w:proofErr w:type="spellEnd"/>
       <w:r>
         <w:rPr>
           <w:rFonts w:ascii="Consolas" w:hAnsi="Consolas" w:cs="Courier New"/>
@@ -3000,6 +3255,7 @@
         </w:rPr>
         <w:br/>
       </w:r>
+      <w:proofErr w:type="spellStart"/>
       <w:r>
         <w:rPr>
           <w:rFonts w:ascii="Consolas" w:hAnsi="Consolas" w:cs="Courier New"/>
@@ -3008,6 +3264,7 @@
         </w:rPr>
         <w:t>FileIOInit</w:t>
       </w:r>
+      <w:proofErr w:type="spellEnd"/>
       <w:r>
         <w:rPr>
           <w:rFonts w:ascii="Consolas" w:hAnsi="Consolas" w:cs="Courier New"/>
@@ -3016,6 +3273,7 @@
         </w:rPr>
         <w:br/>
       </w:r>
+      <w:proofErr w:type="spellStart"/>
       <w:r>
         <w:rPr>
           <w:rFonts w:ascii="Consolas" w:hAnsi="Consolas" w:cs="Courier New"/>
@@ -3024,6 +3282,7 @@
         </w:rPr>
         <w:t>MemoryPageFaults</w:t>
       </w:r>
+      <w:proofErr w:type="spellEnd"/>
       <w:r>
         <w:rPr>
           <w:rFonts w:ascii="Consolas" w:hAnsi="Consolas" w:cs="Courier New"/>
@@ -3048,6 +3307,7 @@
         </w:rPr>
         <w:br/>
       </w:r>
+      <w:proofErr w:type="spellStart"/>
       <w:r>
         <w:rPr>
           <w:rFonts w:ascii="Consolas" w:hAnsi="Consolas" w:cs="Courier New"/>
@@ -3057,6 +3317,7 @@
         <w:lastRenderedPageBreak/>
         <w:t>SystemCall</w:t>
       </w:r>
+      <w:proofErr w:type="spellEnd"/>
       <w:r>
         <w:rPr>
           <w:rFonts w:ascii="Consolas" w:hAnsi="Consolas" w:cs="Courier New"/>
@@ -3065,6 +3326,7 @@
         </w:rPr>
         <w:br/>
       </w:r>
+      <w:proofErr w:type="spellStart"/>
       <w:r>
         <w:rPr>
           <w:rFonts w:ascii="Consolas" w:hAnsi="Consolas" w:cs="Courier New"/>
@@ -3073,6 +3335,7 @@
         </w:rPr>
         <w:t>VirtualAlloc</w:t>
       </w:r>
+      <w:proofErr w:type="spellEnd"/>
       <w:r>
         <w:rPr>
           <w:rFonts w:ascii="Consolas" w:hAnsi="Consolas" w:cs="Courier New"/>
@@ -3081,6 +3344,7 @@
         </w:rPr>
         <w:br/>
       </w:r>
+      <w:proofErr w:type="spellStart"/>
       <w:r>
         <w:rPr>
           <w:rFonts w:ascii="Consolas" w:hAnsi="Consolas" w:cs="Courier New"/>
@@ -3089,6 +3353,7 @@
         </w:rPr>
         <w:t>AdvancedLocalProcedureCalls</w:t>
       </w:r>
+      <w:proofErr w:type="spellEnd"/>
       <w:r>
         <w:rPr>
           <w:rFonts w:ascii="Consolas" w:hAnsi="Consolas" w:cs="Courier New"/>
@@ -3097,6 +3362,7 @@
         </w:rPr>
         <w:br/>
       </w:r>
+      <w:proofErr w:type="spellStart"/>
       <w:r>
         <w:rPr>
           <w:rFonts w:ascii="Consolas" w:hAnsi="Consolas" w:cs="Courier New"/>
@@ -3105,6 +3371,7 @@
         </w:rPr>
         <w:t>DeferedProcedureCalls</w:t>
       </w:r>
+      <w:proofErr w:type="spellEnd"/>
       <w:r>
         <w:rPr>
           <w:rFonts w:ascii="Consolas" w:hAnsi="Consolas" w:cs="Courier New"/>
@@ -3145,6 +3412,7 @@
         </w:rPr>
         <w:br/>
       </w:r>
+      <w:proofErr w:type="spellStart"/>
       <w:r>
         <w:rPr>
           <w:rFonts w:ascii="Consolas" w:hAnsi="Consolas" w:cs="Courier New"/>
@@ -3153,7 +3421,72 @@
         </w:rPr>
         <w:t>SplitIO</w:t>
       </w:r>
+      <w:proofErr w:type="spellEnd"/>
     </w:p>
+    <w:p>
+      <w:pPr>
+        <w:pStyle w:val="Heading2"/>
+      </w:pPr>
+      <w:r>
+        <w:t>Process Names</w:t>
+      </w:r>
+    </w:p>
+    <w:p>
+      <w:r>
+        <w:t xml:space="preserve">Due to the large volume of data, the users must subscribe to the processes they’d like to listen to. </w:t>
+      </w:r>
+      <w:r>
+        <w:t>In the options, may add the name of the process to listen for. It is important to strip the process of its extension name, for example, “chrome.exe” will be added as “chrome”.</w:t>
+      </w:r>
+      <w:r>
+        <w:t xml:space="preserve"> You may find the list of running process’ names by executing the PowerShell command below:</w:t>
+      </w:r>
+    </w:p>
+    <w:p>
+      <w:pPr>
+        <w:pStyle w:val="NormalWeb"/>
+        <w:pBdr>
+          <w:top w:val="single" w:sz="6" w:space="2" w:color="888888"/>
+          <w:left w:val="single" w:sz="6" w:space="2" w:color="888888"/>
+          <w:bottom w:val="single" w:sz="6" w:space="2" w:color="888888"/>
+          <w:right w:val="single" w:sz="6" w:space="2" w:color="888888"/>
+        </w:pBdr>
+        <w:tabs>
+          <w:tab w:val="left" w:pos="916"/>
+          <w:tab w:val="left" w:pos="1832"/>
+          <w:tab w:val="left" w:pos="2748"/>
+          <w:tab w:val="left" w:pos="3664"/>
+          <w:tab w:val="left" w:pos="4580"/>
+          <w:tab w:val="left" w:pos="5496"/>
+          <w:tab w:val="left" w:pos="6412"/>
+          <w:tab w:val="left" w:pos="7328"/>
+          <w:tab w:val="left" w:pos="8244"/>
+          <w:tab w:val="left" w:pos="9160"/>
+          <w:tab w:val="left" w:pos="10076"/>
+          <w:tab w:val="left" w:pos="10992"/>
+          <w:tab w:val="left" w:pos="11908"/>
+          <w:tab w:val="left" w:pos="12824"/>
+          <w:tab w:val="left" w:pos="13740"/>
+          <w:tab w:val="left" w:pos="14656"/>
+        </w:tabs>
+        <w:spacing w:before="0" w:beforeAutospacing="0" w:after="0" w:afterAutospacing="0"/>
+        <w:divId w:val="406417826"/>
+        <w:rPr>
+          <w:rFonts w:ascii="Consolas" w:hAnsi="Consolas" w:cs="Courier New"/>
+          <w:sz w:val="17"/>
+          <w:szCs w:val="17"/>
+        </w:rPr>
+      </w:pPr>
+      <w:r>
+        <w:rPr>
+          <w:rFonts w:ascii="Consolas" w:hAnsi="Consolas" w:cs="Courier New"/>
+          <w:sz w:val="17"/>
+          <w:szCs w:val="17"/>
+        </w:rPr>
+        <w:t>Get-Process | Select-Object Name | Sort-Object Name</w:t>
+      </w:r>
+    </w:p>
+    <w:p/>
     <w:p/>
     <w:sectPr>
       <w:pgSz w:w="12240" w:h="15840"/>
@@ -3938,6 +4271,7 @@
   <w:style w:type="character" w:default="1" w:styleId="DefaultParagraphFont">
     <w:name w:val="Default Paragraph Font"/>
     <w:uiPriority w:val="1"/>
+    <w:semiHidden/>
     <w:unhideWhenUsed/>
   </w:style>
   <w:style w:type="table" w:default="1" w:styleId="TableNormal">
@@ -4254,7 +4588,6 @@
     <w:name w:val="Normal (Web)"/>
     <w:basedOn w:val="Normal"/>
     <w:uiPriority w:val="99"/>
-    <w:semiHidden/>
     <w:unhideWhenUsed/>
     <w:rsid w:val="00C15C53"/>
     <w:pPr>

</xml_diff>